<commit_message>
Added documentation and screenshots
</commit_message>
<xml_diff>
--- a/7.Project Documentation/Project Executable Files.docx
+++ b/7.Project Documentation/Project Executable Files.docx
@@ -335,13 +335,25 @@
             <w:pPr>
               <w:ind w:left="125"/>
             </w:pPr>
+            <w:proofErr w:type="spellStart"/>
+            <w:proofErr w:type="gramStart"/>
             <w:r>
               <w:rPr>
                 <w:rFonts w:ascii="Arial" w:eastAsia="Arial" w:hAnsi="Arial" w:cs="Arial"/>
                 <w:b/>
                 <w:sz w:val="24"/>
               </w:rPr>
-              <w:t xml:space="preserve">S.No </w:t>
+              <w:t>S.No</w:t>
+            </w:r>
+            <w:proofErr w:type="spellEnd"/>
+            <w:proofErr w:type="gramEnd"/>
+            <w:r>
+              <w:rPr>
+                <w:rFonts w:ascii="Arial" w:eastAsia="Arial" w:hAnsi="Arial" w:cs="Arial"/>
+                <w:b/>
+                <w:sz w:val="24"/>
+              </w:rPr>
+              <w:t xml:space="preserve"> </w:t>
             </w:r>
           </w:p>
         </w:tc>
@@ -715,7 +727,25 @@
                 <w:rFonts w:ascii="Arial" w:eastAsia="Arial" w:hAnsi="Arial" w:cs="Arial"/>
                 <w:sz w:val="24"/>
               </w:rPr>
-              <w:t xml:space="preserve">requirements.txt / package.json / dependency file </w:t>
+              <w:t xml:space="preserve">requirements.txt / </w:t>
+            </w:r>
+            <w:proofErr w:type="spellStart"/>
+            <w:proofErr w:type="gramStart"/>
+            <w:r>
+              <w:rPr>
+                <w:rFonts w:ascii="Arial" w:eastAsia="Arial" w:hAnsi="Arial" w:cs="Arial"/>
+                <w:sz w:val="24"/>
+              </w:rPr>
+              <w:t>package.json</w:t>
+            </w:r>
+            <w:proofErr w:type="spellEnd"/>
+            <w:proofErr w:type="gramEnd"/>
+            <w:r>
+              <w:rPr>
+                <w:rFonts w:ascii="Arial" w:eastAsia="Arial" w:hAnsi="Arial" w:cs="Arial"/>
+                <w:sz w:val="24"/>
+              </w:rPr>
+              <w:t xml:space="preserve"> / dependency file </w:t>
             </w:r>
           </w:p>
         </w:tc>
@@ -952,7 +982,39 @@
                 <w:sz w:val="24"/>
               </w:rPr>
               <w:tab/>
-              <w:t xml:space="preserve">configuration file (.env.example similar) </w:t>
+              <w:t xml:space="preserve">configuration file </w:t>
+            </w:r>
+            <w:proofErr w:type="gramStart"/>
+            <w:r>
+              <w:rPr>
+                <w:rFonts w:ascii="Arial" w:eastAsia="Arial" w:hAnsi="Arial" w:cs="Arial"/>
+                <w:sz w:val="24"/>
+              </w:rPr>
+              <w:t>(.</w:t>
+            </w:r>
+            <w:proofErr w:type="spellStart"/>
+            <w:r>
+              <w:rPr>
+                <w:rFonts w:ascii="Arial" w:eastAsia="Arial" w:hAnsi="Arial" w:cs="Arial"/>
+                <w:sz w:val="24"/>
+              </w:rPr>
+              <w:t>env</w:t>
+            </w:r>
+            <w:proofErr w:type="gramEnd"/>
+            <w:r>
+              <w:rPr>
+                <w:rFonts w:ascii="Arial" w:eastAsia="Arial" w:hAnsi="Arial" w:cs="Arial"/>
+                <w:sz w:val="24"/>
+              </w:rPr>
+              <w:t>.example</w:t>
+            </w:r>
+            <w:proofErr w:type="spellEnd"/>
+            <w:r>
+              <w:rPr>
+                <w:rFonts w:ascii="Arial" w:eastAsia="Arial" w:hAnsi="Arial" w:cs="Arial"/>
+                <w:sz w:val="24"/>
+              </w:rPr>
+              <w:t xml:space="preserve"> similar) </w:t>
             </w:r>
           </w:p>
         </w:tc>
@@ -1301,12 +1363,21 @@
             <w:pPr>
               <w:ind w:left="125"/>
             </w:pPr>
-            <w:r>
-              <w:rPr>
-                <w:rFonts w:ascii="Arial" w:eastAsia="Arial" w:hAnsi="Arial" w:cs="Arial"/>
-                <w:sz w:val="24"/>
-              </w:rPr>
-              <w:t xml:space="preserve">Dockerfile / Containerization config (if applicable) </w:t>
+            <w:proofErr w:type="spellStart"/>
+            <w:r>
+              <w:rPr>
+                <w:rFonts w:ascii="Arial" w:eastAsia="Arial" w:hAnsi="Arial" w:cs="Arial"/>
+                <w:sz w:val="24"/>
+              </w:rPr>
+              <w:t>Dockerfile</w:t>
+            </w:r>
+            <w:proofErr w:type="spellEnd"/>
+            <w:r>
+              <w:rPr>
+                <w:rFonts w:ascii="Arial" w:eastAsia="Arial" w:hAnsi="Arial" w:cs="Arial"/>
+                <w:sz w:val="24"/>
+              </w:rPr>
+              <w:t xml:space="preserve"> / Containerization config (if applicable) </w:t>
             </w:r>
           </w:p>
         </w:tc>
@@ -1676,8 +1747,13 @@
         <w:t>📁</w:t>
       </w:r>
       <w:r>
-        <w:t xml:space="preserve"> Flood_Prediction_System</w:t>
-      </w:r>
+        <w:t xml:space="preserve"> </w:t>
+      </w:r>
+      <w:proofErr w:type="spellStart"/>
+      <w:r>
+        <w:t>Flood_Prediction_System</w:t>
+      </w:r>
+      <w:proofErr w:type="spellEnd"/>
     </w:p>
     <w:p>
       <w:pPr>
@@ -1753,8 +1829,15 @@
         <w:t>📄</w:t>
       </w:r>
       <w:r>
-        <w:t xml:space="preserve"> floods.save</w:t>
-      </w:r>
+        <w:t xml:space="preserve"> </w:t>
+      </w:r>
+      <w:proofErr w:type="spellStart"/>
+      <w:proofErr w:type="gramStart"/>
+      <w:r>
+        <w:t>floods.save</w:t>
+      </w:r>
+      <w:proofErr w:type="spellEnd"/>
+      <w:proofErr w:type="gramEnd"/>
     </w:p>
     <w:p>
       <w:pPr>
@@ -1776,8 +1859,15 @@
         <w:t>📄</w:t>
       </w:r>
       <w:r>
-        <w:t xml:space="preserve"> transform.save</w:t>
-      </w:r>
+        <w:t xml:space="preserve"> </w:t>
+      </w:r>
+      <w:proofErr w:type="spellStart"/>
+      <w:proofErr w:type="gramStart"/>
+      <w:r>
+        <w:t>transform.save</w:t>
+      </w:r>
+      <w:proofErr w:type="spellEnd"/>
+      <w:proofErr w:type="gramEnd"/>
     </w:p>
     <w:p>
       <w:pPr>
@@ -2022,8 +2112,13 @@
         <w:t>📁</w:t>
       </w:r>
       <w:r>
-        <w:t xml:space="preserve"> css</w:t>
-      </w:r>
+        <w:t xml:space="preserve"> </w:t>
+      </w:r>
+      <w:proofErr w:type="spellStart"/>
+      <w:r>
+        <w:t>css</w:t>
+      </w:r>
+      <w:proofErr w:type="spellEnd"/>
     </w:p>
     <w:p>
       <w:pPr>
@@ -2073,8 +2168,13 @@
         <w:t>📁</w:t>
       </w:r>
       <w:r>
-        <w:t xml:space="preserve"> js</w:t>
-      </w:r>
+        <w:t xml:space="preserve"> </w:t>
+      </w:r>
+      <w:proofErr w:type="spellStart"/>
+      <w:r>
+        <w:t>js</w:t>
+      </w:r>
+      <w:proofErr w:type="spellEnd"/>
     </w:p>
     <w:p>
       <w:pPr>
@@ -2225,8 +2325,8 @@
         <w:tblLook w:val="04A0" w:firstRow="1" w:lastRow="0" w:firstColumn="1" w:lastColumn="0" w:noHBand="0" w:noVBand="1"/>
       </w:tblPr>
       <w:tblGrid>
-        <w:gridCol w:w="3120"/>
-        <w:gridCol w:w="6240"/>
+        <w:gridCol w:w="2028"/>
+        <w:gridCol w:w="7659"/>
       </w:tblGrid>
       <w:tr>
         <w:trPr>
@@ -2603,6 +2703,13 @@
                 <w:sz w:val="24"/>
               </w:rPr>
               <w:t xml:space="preserve"> </w:t>
+            </w:r>
+            <w:r>
+              <w:rPr>
+                <w:rFonts w:ascii="Times New Roman" w:eastAsia="Times New Roman" w:hAnsi="Times New Roman" w:cs="Times New Roman"/>
+                <w:sz w:val="24"/>
+              </w:rPr>
+              <w:t>https://drive.google.com/file/d/1TpetchQqMLeMMhl2fc4V2mxO_ssk3Lut/view?usp=sharing</w:t>
             </w:r>
           </w:p>
         </w:tc>
@@ -2733,9 +2840,11 @@
           <w:bCs/>
         </w:rPr>
       </w:pPr>
+      <w:proofErr w:type="spellStart"/>
       <w:r>
         <w:t>Numpy</w:t>
       </w:r>
+      <w:proofErr w:type="spellEnd"/>
     </w:p>
     <w:p>
       <w:pPr>
@@ -2769,9 +2878,11 @@
           <w:bCs/>
         </w:rPr>
       </w:pPr>
+      <w:proofErr w:type="spellStart"/>
       <w:r>
         <w:t>Joblib</w:t>
       </w:r>
+      <w:proofErr w:type="spellEnd"/>
     </w:p>
     <w:p>
       <w:pPr>
@@ -2832,7 +2943,21 @@
         <w:rPr>
           <w:szCs w:val="22"/>
         </w:rPr>
-        <w:t>clone the Github reposi</w:t>
+        <w:t xml:space="preserve">clone the </w:t>
+      </w:r>
+      <w:proofErr w:type="spellStart"/>
+      <w:r>
+        <w:rPr>
+          <w:szCs w:val="22"/>
+        </w:rPr>
+        <w:t>Github</w:t>
+      </w:r>
+      <w:proofErr w:type="spellEnd"/>
+      <w:r>
+        <w:rPr>
+          <w:szCs w:val="22"/>
+        </w:rPr>
+        <w:t xml:space="preserve"> reposi</w:t>
       </w:r>
       <w:r>
         <w:rPr>
@@ -2915,6 +3040,7 @@
         <w:rPr>
           <w:szCs w:val="22"/>
         </w:rPr>
+        <w:lastRenderedPageBreak/>
         <w:t>Run the application:</w:t>
       </w:r>
     </w:p>
@@ -2952,7 +3078,6 @@
         <w:rPr>
           <w:szCs w:val="22"/>
         </w:rPr>
-        <w:lastRenderedPageBreak/>
         <w:t>Open the browser and visit:</w:t>
       </w:r>
     </w:p>
@@ -3066,13 +3191,25 @@
             <w:pPr>
               <w:ind w:left="120"/>
             </w:pPr>
+            <w:proofErr w:type="spellStart"/>
+            <w:proofErr w:type="gramStart"/>
             <w:r>
               <w:rPr>
                 <w:rFonts w:ascii="Arial" w:eastAsia="Arial" w:hAnsi="Arial" w:cs="Arial"/>
                 <w:b/>
                 <w:sz w:val="24"/>
               </w:rPr>
-              <w:t xml:space="preserve">S.No </w:t>
+              <w:t>S.No</w:t>
+            </w:r>
+            <w:proofErr w:type="spellEnd"/>
+            <w:proofErr w:type="gramEnd"/>
+            <w:r>
+              <w:rPr>
+                <w:rFonts w:ascii="Arial" w:eastAsia="Arial" w:hAnsi="Arial" w:cs="Arial"/>
+                <w:b/>
+                <w:sz w:val="24"/>
+              </w:rPr>
+              <w:t xml:space="preserve"> </w:t>
             </w:r>
           </w:p>
         </w:tc>

</xml_diff>